<commit_message>
feat(auth): auto-login on AuthPage mount
</commit_message>
<xml_diff>
--- a/02_경진대회_기획서.docx
+++ b/02_경진대회_기획서.docx
@@ -637,24 +637,6 @@
                 <w:szCs w:val="24"/>
               </w:rPr>
             </w:pPr>
-            <w:r>
-              <w:rPr>
-                <w:rFonts w:ascii="굴림" w:eastAsia="굴림" w:cs="굴림"/>
-                <w:color w:val="auto"/>
-                <w:sz w:val="24"/>
-                <w:szCs w:val="24"/>
-              </w:rPr>
-              <w:t>※</w:t>
-            </w:r>
-            <w:r>
-              <w:rPr>
-                <w:rFonts w:ascii="굴림" w:eastAsia="굴림" w:cs="굴림"/>
-                <w:color w:val="auto"/>
-                <w:sz w:val="24"/>
-                <w:szCs w:val="24"/>
-              </w:rPr>
-              <w:t xml:space="preserve"> 구글 플레이스토어 URL 기재</w:t>
-            </w:r>
           </w:p>
         </w:tc>
       </w:tr>
@@ -752,24 +734,6 @@
                 <w:szCs w:val="24"/>
               </w:rPr>
             </w:pPr>
-            <w:r>
-              <w:rPr>
-                <w:rFonts w:ascii="굴림" w:eastAsia="굴림" w:cs="굴림"/>
-                <w:color w:val="auto"/>
-                <w:sz w:val="24"/>
-                <w:szCs w:val="24"/>
-              </w:rPr>
-              <w:t>※</w:t>
-            </w:r>
-            <w:r>
-              <w:rPr>
-                <w:rFonts w:ascii="굴림" w:eastAsia="굴림" w:cs="굴림"/>
-                <w:color w:val="auto"/>
-                <w:sz w:val="24"/>
-                <w:szCs w:val="24"/>
-              </w:rPr>
-              <w:t xml:space="preserve"> iOS 앱 스토어 URL 기재 </w:t>
-            </w:r>
           </w:p>
         </w:tc>
       </w:tr>
@@ -1164,37 +1128,12 @@
                 <w:color w:val="auto"/>
               </w:rPr>
             </w:pPr>
-            <w:proofErr w:type="spellStart"/>
-            <w:r>
-              <w:rPr>
-                <w:rFonts w:ascii="굴림" w:eastAsia="굴림" w:cs="굴림"/>
-                <w:color w:val="auto"/>
-              </w:rPr>
-              <w:t>FieldGuard</w:t>
-            </w:r>
-            <w:proofErr w:type="spellEnd"/>
-            <w:r>
-              <w:rPr>
-                <w:rFonts w:ascii="굴림" w:eastAsia="굴림" w:cs="굴림"/>
-                <w:color w:val="auto"/>
-              </w:rPr>
-              <w:t xml:space="preserve"> AI는 농민이 자신의 필지와 재배 작물을 등록하면 </w:t>
-            </w:r>
-            <w:proofErr w:type="spellStart"/>
-            <w:r>
-              <w:rPr>
-                <w:rFonts w:ascii="굴림" w:eastAsia="굴림" w:cs="굴림"/>
-                <w:color w:val="auto"/>
-              </w:rPr>
-              <w:t>팜맵</w:t>
-            </w:r>
-            <w:proofErr w:type="spellEnd"/>
-            <w:r>
-              <w:rPr>
-                <w:rFonts w:ascii="굴림" w:eastAsia="굴림" w:cs="굴림"/>
-                <w:color w:val="auto"/>
-              </w:rPr>
-              <w:t>, 기상청 예보, 농사로 공공데이터와 AI를 결합해 오늘의 기상</w:t>
+            <w:r>
+              <w:rPr>
+                <w:rFonts w:ascii="굴림" w:eastAsia="굴림" w:cs="굴림"/>
+                <w:color w:val="auto"/>
+              </w:rPr>
+              <w:t>FieldGuard AI는 농민이 자신의 필지와 재배 작물을 등록하면 팜맵, 기상청 예보, 농사로 공공데이터와 AI를 결합해 오늘의 기상</w:t>
             </w:r>
             <w:r>
               <w:rPr>
@@ -1208,23 +1147,7 @@
                 <w:rFonts w:ascii="굴림" w:eastAsia="굴림" w:cs="굴림"/>
                 <w:color w:val="auto"/>
               </w:rPr>
-              <w:t xml:space="preserve">병해충 위험도, 작업 우선순위, 사진 기반 병해충 의심 후보, 현장 확인 체크리스트를 제공하는 </w:t>
-            </w:r>
-            <w:proofErr w:type="spellStart"/>
-            <w:r>
-              <w:rPr>
-                <w:rFonts w:ascii="굴림" w:eastAsia="굴림" w:cs="굴림"/>
-                <w:color w:val="auto"/>
-              </w:rPr>
-              <w:t>농민용</w:t>
-            </w:r>
-            <w:proofErr w:type="spellEnd"/>
-            <w:r>
-              <w:rPr>
-                <w:rFonts w:ascii="굴림" w:eastAsia="굴림" w:cs="굴림"/>
-                <w:color w:val="auto"/>
-              </w:rPr>
-              <w:t xml:space="preserve"> Web App 서비스이다. 본 서비스는 병해충 확정 진단이나 농약 처방이 아니라, 공공데이터 접근성과 현장 의사결정 효율을 높이는 위험 예측</w:t>
+              <w:t>병해충 위험도, 작업 우선순위, 사진 기반 병해충 의심 후보, 현장 확인 체크리스트를 제공하는 농민용 Web App 서비스이다. 본 서비스는 병해충 확정 진단이나 농약 처방이 아니라, 공공데이터 접근성과 현장 의사결정 효율을 높이는 위험 예측</w:t>
             </w:r>
             <w:r>
               <w:rPr>
@@ -1335,21 +1258,12 @@
               </w:rPr>
               <w:t xml:space="preserve"> </w:t>
             </w:r>
-            <w:proofErr w:type="spellStart"/>
-            <w:r>
-              <w:rPr>
-                <w:rFonts w:ascii="굴림" w:eastAsia="굴림" w:cs="굴림"/>
-                <w:color w:val="auto"/>
-              </w:rPr>
-              <w:t>FieldGuard</w:t>
-            </w:r>
-            <w:proofErr w:type="spellEnd"/>
-            <w:r>
-              <w:rPr>
-                <w:rFonts w:ascii="굴림" w:eastAsia="굴림" w:cs="굴림"/>
-                <w:color w:val="auto"/>
-              </w:rPr>
-              <w:t xml:space="preserve"> AI의 핵심 기능은 필지 기반 위험 판단과 실행 가능한 작업 카드 제공이다.</w:t>
+            <w:r>
+              <w:rPr>
+                <w:rFonts w:ascii="굴림" w:eastAsia="굴림" w:cs="굴림"/>
+                <w:color w:val="auto"/>
+              </w:rPr>
+              <w:t>FieldGuard AI의 핵심 기능은 필지 기반 위험 판단과 실행 가능한 작업 카드 제공이다.</w:t>
             </w:r>
           </w:p>
           <w:p>
@@ -1380,23 +1294,7 @@
                 <w:rFonts w:ascii="굴림" w:eastAsia="굴림" w:cs="굴림"/>
                 <w:color w:val="auto"/>
               </w:rPr>
-              <w:t xml:space="preserve">경도 입력 방식으로 자신의 농지를 등록한다. 등록된 필지는 </w:t>
-            </w:r>
-            <w:proofErr w:type="spellStart"/>
-            <w:r>
-              <w:rPr>
-                <w:rFonts w:ascii="굴림" w:eastAsia="굴림" w:cs="굴림"/>
-                <w:color w:val="auto"/>
-              </w:rPr>
-              <w:t>팜맵</w:t>
-            </w:r>
-            <w:proofErr w:type="spellEnd"/>
-            <w:r>
-              <w:rPr>
-                <w:rFonts w:ascii="굴림" w:eastAsia="굴림" w:cs="굴림"/>
-                <w:color w:val="auto"/>
-              </w:rPr>
-              <w:t xml:space="preserve"> 데이터를 통해 위치, 면적, 농경지 정보를 확인하고, 필지별 재배 작물을 연결한다.</w:t>
+              <w:t>경도 입력 방식으로 자신의 농지를 등록한다. 등록된 필지는 팜맵 데이터를 통해 위치, 면적, 농경지 정보를 확인하고, 필지별 재배 작물을 연결한다.</w:t>
             </w:r>
           </w:p>
           <w:p>
@@ -1422,21 +1320,12 @@
               </w:rPr>
               <w:t>·</w:t>
             </w:r>
-            <w:proofErr w:type="spellStart"/>
-            <w:r>
-              <w:rPr>
-                <w:rFonts w:ascii="굴림" w:eastAsia="굴림" w:cs="굴림"/>
-                <w:color w:val="auto"/>
-              </w:rPr>
-              <w:t>농작업</w:t>
-            </w:r>
-            <w:proofErr w:type="spellEnd"/>
-            <w:r>
-              <w:rPr>
-                <w:rFonts w:ascii="굴림" w:eastAsia="굴림" w:cs="굴림"/>
-                <w:color w:val="auto"/>
-              </w:rPr>
-              <w:t xml:space="preserve"> 정보를 결합해 강수, 고온, 저온, 강풍, 습도, 병해충 발생 가능성을 분석한다. 분석 결과는 단순 수치가 아니라 </w:t>
+            <w:r>
+              <w:rPr>
+                <w:rFonts w:ascii="굴림" w:eastAsia="굴림" w:cs="굴림"/>
+                <w:color w:val="auto"/>
+              </w:rPr>
+              <w:t xml:space="preserve">농작업 정보를 결합해 강수, 고온, 저온, 강풍, 습도, 병해충 발생 가능성을 분석한다. 분석 결과는 단순 수치가 아니라 </w:t>
             </w:r>
             <w:r>
               <w:rPr>
@@ -1574,21 +1463,12 @@
                 <w:color w:val="auto"/>
               </w:rPr>
             </w:pPr>
-            <w:proofErr w:type="spellStart"/>
-            <w:r>
-              <w:rPr>
-                <w:rFonts w:ascii="굴림" w:eastAsia="굴림" w:cs="굴림"/>
-                <w:color w:val="auto"/>
-              </w:rPr>
-              <w:t>병징</w:t>
-            </w:r>
-            <w:proofErr w:type="spellEnd"/>
-            <w:r>
-              <w:rPr>
-                <w:rFonts w:ascii="굴림" w:eastAsia="굴림" w:cs="굴림"/>
-                <w:color w:val="auto"/>
-              </w:rPr>
-              <w:t xml:space="preserve"> 사진 기반 AI 의심 판독</w:t>
+            <w:r>
+              <w:rPr>
+                <w:rFonts w:ascii="굴림" w:eastAsia="굴림" w:cs="굴림"/>
+                <w:color w:val="auto"/>
+              </w:rPr>
+              <w:t>병징 사진 기반 AI 의심 판독</w:t>
             </w:r>
           </w:p>
           <w:p>
@@ -1717,12 +1597,6 @@
                 <w:color w:val="auto"/>
               </w:rPr>
               <w:br/>
-            </w:r>
-            <w:r>
-              <w:rPr>
-                <w:rFonts w:ascii="굴림" w:eastAsia="굴림" w:cs="굴림"/>
-                <w:color w:val="auto"/>
-              </w:rPr>
               <w:t>예시 시나리오는 다음과 같다.</w:t>
             </w:r>
             <w:r>
@@ -1774,17 +1648,8 @@
                 <w:rFonts w:ascii="굴림" w:eastAsia="굴림" w:cs="굴림"/>
                 <w:color w:val="auto"/>
               </w:rPr>
-              <w:t xml:space="preserve"> 원인: 내일 오전 강수 예보, 높은 습도, 배추 </w:t>
-            </w:r>
-            <w:proofErr w:type="spellStart"/>
-            <w:r>
-              <w:rPr>
-                <w:rFonts w:ascii="굴림" w:eastAsia="굴림" w:cs="굴림"/>
-                <w:color w:val="auto"/>
-              </w:rPr>
-              <w:t>생육기</w:t>
-            </w:r>
-            <w:proofErr w:type="spellEnd"/>
+              <w:t xml:space="preserve"> 원인: 내일 오전 강수 예보, 높은 습도, 배추 생육기</w:t>
+            </w:r>
           </w:p>
           <w:p>
             <w:pPr>
@@ -1807,23 +1672,7 @@
                 <w:rFonts w:ascii="굴림" w:eastAsia="굴림" w:cs="굴림"/>
                 <w:color w:val="auto"/>
               </w:rPr>
-              <w:t xml:space="preserve"> 항목: 잎 뒷면 </w:t>
-            </w:r>
-            <w:proofErr w:type="spellStart"/>
-            <w:r>
-              <w:rPr>
-                <w:rFonts w:ascii="굴림" w:eastAsia="굴림" w:cs="굴림"/>
-                <w:color w:val="auto"/>
-              </w:rPr>
-              <w:t>병반</w:t>
-            </w:r>
-            <w:proofErr w:type="spellEnd"/>
-            <w:r>
-              <w:rPr>
-                <w:rFonts w:ascii="굴림" w:eastAsia="굴림" w:cs="굴림"/>
-                <w:color w:val="auto"/>
-              </w:rPr>
-              <w:t>, 줄기 물러짐, 배수 상태</w:t>
+              <w:t xml:space="preserve"> 항목: 잎 뒷면 병반, 줄기 물러짐, 배수 상태</w:t>
             </w:r>
           </w:p>
           <w:p>
@@ -1831,15 +1680,15 @@
               <w:pStyle w:val="a8"/>
               <w:spacing w:line="240" w:lineRule="auto"/>
               <w:rPr>
+                <w:rFonts w:ascii="굴림" w:eastAsia="굴림" w:cs="굴림"/>
+                <w:color w:val="auto"/>
+              </w:rPr>
+            </w:pPr>
+            <w:r>
+              <w:rPr>
                 <w:rFonts w:ascii="굴림" w:eastAsia="굴림" w:cs="굴림" w:hint="eastAsia"/>
                 <w:color w:val="auto"/>
               </w:rPr>
-            </w:pPr>
-            <w:r>
-              <w:rPr>
-                <w:rFonts w:ascii="굴림" w:eastAsia="굴림" w:cs="굴림" w:hint="eastAsia"/>
-                <w:color w:val="auto"/>
-              </w:rPr>
               <w:t>권장</w:t>
             </w:r>
             <w:r>
@@ -1847,23 +1696,7 @@
                 <w:rFonts w:ascii="굴림" w:eastAsia="굴림" w:cs="굴림"/>
                 <w:color w:val="auto"/>
               </w:rPr>
-              <w:t xml:space="preserve"> 작업: 오전 중 배수로 점검 후 </w:t>
-            </w:r>
-            <w:proofErr w:type="spellStart"/>
-            <w:r>
-              <w:rPr>
-                <w:rFonts w:ascii="굴림" w:eastAsia="굴림" w:cs="굴림"/>
-                <w:color w:val="auto"/>
-              </w:rPr>
-              <w:t>병징</w:t>
-            </w:r>
-            <w:proofErr w:type="spellEnd"/>
-            <w:r>
-              <w:rPr>
-                <w:rFonts w:ascii="굴림" w:eastAsia="굴림" w:cs="굴림"/>
-                <w:color w:val="auto"/>
-              </w:rPr>
-              <w:t xml:space="preserve"> 사진 기록</w:t>
+              <w:t xml:space="preserve"> 작업: 오전 중 배수로 점검 후 병징 사진 기록</w:t>
             </w:r>
           </w:p>
           <w:p>
@@ -1962,21 +1795,12 @@
               </w:rPr>
               <w:t xml:space="preserve"> </w:t>
             </w:r>
-            <w:proofErr w:type="spellStart"/>
-            <w:r>
-              <w:rPr>
-                <w:rFonts w:ascii="굴림" w:eastAsia="굴림" w:cs="굴림"/>
-                <w:color w:val="auto"/>
-              </w:rPr>
-              <w:t>FieldGuard</w:t>
-            </w:r>
-            <w:proofErr w:type="spellEnd"/>
-            <w:r>
-              <w:rPr>
-                <w:rFonts w:ascii="굴림" w:eastAsia="굴림" w:cs="굴림"/>
-                <w:color w:val="auto"/>
-              </w:rPr>
-              <w:t xml:space="preserve"> AI는 데이터 분석</w:t>
+            <w:r>
+              <w:rPr>
+                <w:rFonts w:ascii="굴림" w:eastAsia="굴림" w:cs="굴림"/>
+                <w:color w:val="auto"/>
+              </w:rPr>
+              <w:t>FieldGuard AI는 데이터 분석</w:t>
             </w:r>
             <w:r>
               <w:rPr>
@@ -2008,23 +1832,7 @@
                 <w:rFonts w:ascii="굴림" w:eastAsia="굴림" w:cs="굴림"/>
                 <w:color w:val="auto"/>
               </w:rPr>
-              <w:t xml:space="preserve">첫째, 공공데이터 기반 위험도 분석에 AI를 활용한다. 기상청 예보, 농사로 병해충 발생정보, </w:t>
-            </w:r>
-            <w:proofErr w:type="spellStart"/>
-            <w:r>
-              <w:rPr>
-                <w:rFonts w:ascii="굴림" w:eastAsia="굴림" w:cs="굴림"/>
-                <w:color w:val="auto"/>
-              </w:rPr>
-              <w:t>주간농사정보</w:t>
-            </w:r>
-            <w:proofErr w:type="spellEnd"/>
-            <w:r>
-              <w:rPr>
-                <w:rFonts w:ascii="굴림" w:eastAsia="굴림" w:cs="굴림"/>
-                <w:color w:val="auto"/>
-              </w:rPr>
-              <w:t>, 사용자의 필지</w:t>
+              <w:t>첫째, 공공데이터 기반 위험도 분석에 AI를 활용한다. 기상청 예보, 농사로 병해충 발생정보, 주간농사정보, 사용자의 필지</w:t>
             </w:r>
             <w:r>
               <w:rPr>
@@ -2116,23 +1924,7 @@
                 <w:rFonts w:ascii="굴림" w:eastAsia="굴림" w:cs="굴림"/>
                 <w:color w:val="auto"/>
               </w:rPr>
-              <w:t xml:space="preserve">잎 뒷면 </w:t>
-            </w:r>
-            <w:proofErr w:type="spellStart"/>
-            <w:r>
-              <w:rPr>
-                <w:rFonts w:ascii="굴림" w:eastAsia="굴림" w:cs="굴림"/>
-                <w:color w:val="auto"/>
-              </w:rPr>
-              <w:t>병반</w:t>
-            </w:r>
-            <w:proofErr w:type="spellEnd"/>
-            <w:r>
-              <w:rPr>
-                <w:rFonts w:ascii="굴림" w:eastAsia="굴림" w:cs="굴림"/>
-                <w:color w:val="auto"/>
-              </w:rPr>
-              <w:t xml:space="preserve"> 확인</w:t>
+              <w:t>잎 뒷면 병반 확인</w:t>
             </w:r>
             <w:r>
               <w:rPr>
@@ -2169,21 +1961,12 @@
               </w:rPr>
               <w:t>”</w:t>
             </w:r>
-            <w:proofErr w:type="spellStart"/>
-            <w:r>
-              <w:rPr>
-                <w:rFonts w:ascii="굴림" w:eastAsia="굴림" w:cs="굴림"/>
-                <w:color w:val="auto"/>
-              </w:rPr>
-              <w:t>처럼</w:t>
-            </w:r>
-            <w:proofErr w:type="spellEnd"/>
-            <w:r>
-              <w:rPr>
-                <w:rFonts w:ascii="굴림" w:eastAsia="굴림" w:cs="굴림"/>
-                <w:color w:val="auto"/>
-              </w:rPr>
-              <w:t xml:space="preserve"> 바로 실행 가능한 문장으로 변환한다.</w:t>
+            <w:r>
+              <w:rPr>
+                <w:rFonts w:ascii="굴림" w:eastAsia="굴림" w:cs="굴림"/>
+                <w:color w:val="auto"/>
+              </w:rPr>
+              <w:t>처럼 바로 실행 가능한 문장으로 변환한다.</w:t>
             </w:r>
           </w:p>
           <w:p>
@@ -2243,23 +2026,7 @@
                 <w:rFonts w:ascii="굴림" w:eastAsia="굴림" w:cs="굴림"/>
                 <w:color w:val="auto"/>
               </w:rPr>
-              <w:t xml:space="preserve">농약 정보를 종합적으로 해석하기 어렵기 때문이다. </w:t>
-            </w:r>
-            <w:proofErr w:type="spellStart"/>
-            <w:r>
-              <w:rPr>
-                <w:rFonts w:ascii="굴림" w:eastAsia="굴림" w:cs="굴림"/>
-                <w:color w:val="auto"/>
-              </w:rPr>
-              <w:t>FieldGuard</w:t>
-            </w:r>
-            <w:proofErr w:type="spellEnd"/>
-            <w:r>
-              <w:rPr>
-                <w:rFonts w:ascii="굴림" w:eastAsia="굴림" w:cs="굴림"/>
-                <w:color w:val="auto"/>
-              </w:rPr>
-              <w:t xml:space="preserve"> AI는 공공데이터를 단순 조회하는 서비스가 아니라, 필지 조건에 맞게 해석해 의사결정을 보조한다.</w:t>
+              <w:t>농약 정보를 종합적으로 해석하기 어렵기 때문이다. FieldGuard AI는 공공데이터를 단순 조회하는 서비스가 아니라, 필지 조건에 맞게 해석해 의사결정을 보조한다.</w:t>
             </w:r>
           </w:p>
           <w:p>
@@ -2364,39 +2131,7 @@
                 <w:rFonts w:ascii="굴림" w:eastAsia="굴림" w:cs="굴림"/>
                 <w:color w:val="auto"/>
               </w:rPr>
-              <w:t xml:space="preserve">기존 농업 정보 서비스는 날씨, 병해충, 농약 정보, </w:t>
-            </w:r>
-            <w:proofErr w:type="spellStart"/>
-            <w:r>
-              <w:rPr>
-                <w:rFonts w:ascii="굴림" w:eastAsia="굴림" w:cs="굴림"/>
-                <w:color w:val="auto"/>
-              </w:rPr>
-              <w:t>농작업</w:t>
-            </w:r>
-            <w:proofErr w:type="spellEnd"/>
-            <w:r>
-              <w:rPr>
-                <w:rFonts w:ascii="굴림" w:eastAsia="굴림" w:cs="굴림"/>
-                <w:color w:val="auto"/>
-              </w:rPr>
-              <w:t xml:space="preserve"> 정보를 각각 따로 제공하는 경우가 많다. </w:t>
-            </w:r>
-            <w:proofErr w:type="spellStart"/>
-            <w:r>
-              <w:rPr>
-                <w:rFonts w:ascii="굴림" w:eastAsia="굴림" w:cs="굴림"/>
-                <w:color w:val="auto"/>
-              </w:rPr>
-              <w:t>FieldGuard</w:t>
-            </w:r>
-            <w:proofErr w:type="spellEnd"/>
-            <w:r>
-              <w:rPr>
-                <w:rFonts w:ascii="굴림" w:eastAsia="굴림" w:cs="굴림"/>
-                <w:color w:val="auto"/>
-              </w:rPr>
-              <w:t xml:space="preserve"> AI는 이 정보를 필지 단위로 통합하고, 오늘 실행할 작업으로 변환한다는 점에서 차별성이 있다.</w:t>
+              <w:t>기존 농업 정보 서비스는 날씨, 병해충, 농약 정보, 농작업 정보를 각각 따로 제공하는 경우가 많다. FieldGuard AI는 이 정보를 필지 단위로 통합하고, 오늘 실행할 작업으로 변환한다는 점에서 차별성이 있다.</w:t>
             </w:r>
           </w:p>
           <w:p>
@@ -2429,21 +2164,12 @@
                 <w:color w:val="auto"/>
               </w:rPr>
             </w:pPr>
-            <w:proofErr w:type="spellStart"/>
-            <w:r>
-              <w:rPr>
-                <w:rFonts w:ascii="굴림" w:eastAsia="굴림" w:cs="굴림"/>
-                <w:color w:val="auto"/>
-              </w:rPr>
-              <w:t>팜맵</w:t>
-            </w:r>
-            <w:proofErr w:type="spellEnd"/>
-            <w:r>
-              <w:rPr>
-                <w:rFonts w:ascii="굴림" w:eastAsia="굴림" w:cs="굴림"/>
-                <w:color w:val="auto"/>
-              </w:rPr>
-              <w:t xml:space="preserve"> 기반 필지 위치와 면적 정보를 서비스의 기본 단위로 사용</w:t>
+            <w:r>
+              <w:rPr>
+                <w:rFonts w:ascii="굴림" w:eastAsia="굴림" w:cs="굴림"/>
+                <w:color w:val="auto"/>
+              </w:rPr>
+              <w:t>팜맵 기반 필지 위치와 면적 정보를 서비스의 기본 단위로 사용</w:t>
             </w:r>
           </w:p>
           <w:p>
@@ -2644,21 +2370,12 @@
               </w:rPr>
               <w:t>”</w:t>
             </w:r>
-            <w:proofErr w:type="spellStart"/>
-            <w:r>
-              <w:rPr>
-                <w:rFonts w:ascii="굴림" w:eastAsia="굴림" w:cs="굴림"/>
-                <w:color w:val="auto"/>
-              </w:rPr>
-              <w:t>에</w:t>
-            </w:r>
-            <w:proofErr w:type="spellEnd"/>
-            <w:r>
-              <w:rPr>
-                <w:rFonts w:ascii="굴림" w:eastAsia="굴림" w:cs="굴림"/>
-                <w:color w:val="auto"/>
-              </w:rPr>
-              <w:t xml:space="preserve"> 있다. 농민은 여러 사이트를 확인하지 않고도 오늘 위험 요인과 확인할 항목을 한 화면에서 파악할 수 있다.</w:t>
+            <w:r>
+              <w:rPr>
+                <w:rFonts w:ascii="굴림" w:eastAsia="굴림" w:cs="굴림"/>
+                <w:color w:val="auto"/>
+              </w:rPr>
+              <w:t>에 있다. 농민은 여러 사이트를 확인하지 않고도 오늘 위험 요인과 확인할 항목을 한 화면에서 파악할 수 있다.</w:t>
             </w:r>
           </w:p>
           <w:p>
@@ -2748,23 +2465,21 @@
                 <w:spacing w:val="-12"/>
               </w:rPr>
             </w:pPr>
-            <w:proofErr w:type="spellStart"/>
             <w:r>
               <w:rPr>
                 <w:rFonts w:ascii="굴림" w:eastAsia="굴림" w:cs="굴림"/>
                 <w:color w:val="auto"/>
                 <w:spacing w:val="-12"/>
               </w:rPr>
-              <w:t>FieldGuard</w:t>
-            </w:r>
-            <w:proofErr w:type="spellEnd"/>
+              <w:t>FieldGuard AI의 1차 대상 고객은 병해충</w:t>
+            </w:r>
             <w:r>
               <w:rPr>
                 <w:rFonts w:ascii="굴림" w:eastAsia="굴림" w:cs="굴림"/>
                 <w:color w:val="auto"/>
                 <w:spacing w:val="-12"/>
               </w:rPr>
-              <w:t xml:space="preserve"> AI의 1차 대상 고객은 병해충</w:t>
+              <w:t>·</w:t>
             </w:r>
             <w:r>
               <w:rPr>
@@ -2772,6 +2487,14 @@
                 <w:color w:val="auto"/>
                 <w:spacing w:val="-12"/>
               </w:rPr>
+              <w:t>기상재해 대응이 필요한 중소규모 농가와 귀농</w:t>
+            </w:r>
+            <w:r>
+              <w:rPr>
+                <w:rFonts w:ascii="굴림" w:eastAsia="굴림" w:cs="굴림"/>
+                <w:color w:val="auto"/>
+                <w:spacing w:val="-12"/>
+              </w:rPr>
               <w:t>·</w:t>
             </w:r>
             <w:r>
@@ -2780,41 +2503,7 @@
                 <w:color w:val="auto"/>
                 <w:spacing w:val="-12"/>
               </w:rPr>
-              <w:t>기상재해 대응이 필요한 중소규모 농가와 귀농</w:t>
-            </w:r>
-            <w:r>
-              <w:rPr>
-                <w:rFonts w:ascii="굴림" w:eastAsia="굴림" w:cs="굴림"/>
-                <w:color w:val="auto"/>
-                <w:spacing w:val="-12"/>
-              </w:rPr>
-              <w:t>·</w:t>
-            </w:r>
-            <w:r>
-              <w:rPr>
-                <w:rFonts w:ascii="굴림" w:eastAsia="굴림" w:cs="굴림"/>
-                <w:color w:val="auto"/>
-                <w:spacing w:val="-12"/>
-              </w:rPr>
-              <w:t xml:space="preserve">청년농이다. 2차 고객은 농업기술센터, </w:t>
-            </w:r>
-            <w:proofErr w:type="spellStart"/>
-            <w:r>
-              <w:rPr>
-                <w:rFonts w:ascii="굴림" w:eastAsia="굴림" w:cs="굴림"/>
-                <w:color w:val="auto"/>
-                <w:spacing w:val="-12"/>
-              </w:rPr>
-              <w:t>작목반</w:t>
-            </w:r>
-            <w:proofErr w:type="spellEnd"/>
-            <w:r>
-              <w:rPr>
-                <w:rFonts w:ascii="굴림" w:eastAsia="굴림" w:cs="굴림"/>
-                <w:color w:val="auto"/>
-                <w:spacing w:val="-12"/>
-              </w:rPr>
-              <w:t>, 지역 농협, 스마트농업 교육기관이다.</w:t>
+              <w:t>청년농이다. 2차 고객은 농업기술센터, 작목반, 지역 농협, 스마트농업 교육기관이다.</w:t>
             </w:r>
           </w:p>
           <w:p>
@@ -2873,7 +2562,6 @@
                 <w:spacing w:val="-12"/>
               </w:rPr>
             </w:pPr>
-            <w:proofErr w:type="spellStart"/>
             <w:r>
               <w:rPr>
                 <w:rFonts w:ascii="굴림" w:eastAsia="굴림" w:cs="굴림"/>
@@ -2882,7 +2570,6 @@
               </w:rPr>
               <w:t>작목반</w:t>
             </w:r>
-            <w:proofErr w:type="spellEnd"/>
             <w:r>
               <w:rPr>
                 <w:rFonts w:ascii="굴림" w:eastAsia="굴림" w:cs="굴림"/>
@@ -3102,21 +2789,12 @@
               <w:lastRenderedPageBreak/>
               <w:t xml:space="preserve"> </w:t>
             </w:r>
-            <w:proofErr w:type="spellStart"/>
-            <w:r>
-              <w:rPr>
-                <w:rFonts w:ascii="굴림" w:eastAsia="굴림" w:cs="굴림"/>
-                <w:color w:val="auto"/>
-              </w:rPr>
-              <w:t>FieldGuard</w:t>
-            </w:r>
-            <w:proofErr w:type="spellEnd"/>
-            <w:r>
-              <w:rPr>
-                <w:rFonts w:ascii="굴림" w:eastAsia="굴림" w:cs="굴림"/>
-                <w:color w:val="auto"/>
-              </w:rPr>
-              <w:t xml:space="preserve"> AI는 농림축산식품 분야 공공데이터를 서비스의 핵심 판단 근거로 활용한다.</w:t>
+            <w:r>
+              <w:rPr>
+                <w:rFonts w:ascii="굴림" w:eastAsia="굴림" w:cs="굴림"/>
+                <w:color w:val="auto"/>
+              </w:rPr>
+              <w:t>FieldGuard AI는 농림축산식품 분야 공공데이터를 서비스의 핵심 판단 근거로 활용한다.</w:t>
             </w:r>
           </w:p>
           <w:p>
@@ -3305,31 +2983,13 @@
                       <w:color w:val="auto"/>
                     </w:rPr>
                   </w:pPr>
-                  <w:proofErr w:type="spellStart"/>
                   <w:r>
                     <w:rPr>
                       <w:rFonts w:ascii="굴림" w:eastAsia="굴림" w:cs="굴림"/>
                       <w:color w:val="auto"/>
                     </w:rPr>
-                    <w:t>팜맵</w:t>
+                    <w:t>팜맵 OpenAPI</w:t>
                   </w:r>
-                  <w:proofErr w:type="spellEnd"/>
-                  <w:r>
-                    <w:rPr>
-                      <w:rFonts w:ascii="굴림" w:eastAsia="굴림" w:cs="굴림"/>
-                      <w:color w:val="auto"/>
-                    </w:rPr>
-                    <w:t xml:space="preserve"> </w:t>
-                  </w:r>
-                  <w:proofErr w:type="spellStart"/>
-                  <w:r>
-                    <w:rPr>
-                      <w:rFonts w:ascii="굴림" w:eastAsia="굴림" w:cs="굴림"/>
-                      <w:color w:val="auto"/>
-                    </w:rPr>
-                    <w:t>OpenAPI</w:t>
-                  </w:r>
-                  <w:proofErr w:type="spellEnd"/>
                 </w:p>
               </w:tc>
               <w:tc>
@@ -3358,37 +3018,12 @@
                       <w:color w:val="auto"/>
                     </w:rPr>
                   </w:pPr>
-                  <w:proofErr w:type="spellStart"/>
                   <w:r>
                     <w:rPr>
                       <w:rFonts w:ascii="굴림" w:eastAsia="굴림" w:cs="굴림"/>
                       <w:color w:val="auto"/>
                     </w:rPr>
-                    <w:t>농식품</w:t>
-                  </w:r>
-                  <w:proofErr w:type="spellEnd"/>
-                  <w:r>
-                    <w:rPr>
-                      <w:rFonts w:ascii="굴림" w:eastAsia="굴림" w:cs="굴림"/>
-                      <w:color w:val="auto"/>
-                    </w:rPr>
-                    <w:t xml:space="preserve"> </w:t>
-                  </w:r>
-                  <w:proofErr w:type="spellStart"/>
-                  <w:r>
-                    <w:rPr>
-                      <w:rFonts w:ascii="굴림" w:eastAsia="굴림" w:cs="굴림"/>
-                      <w:color w:val="auto"/>
-                    </w:rPr>
-                    <w:t>팜맵</w:t>
-                  </w:r>
-                  <w:proofErr w:type="spellEnd"/>
-                  <w:r>
-                    <w:rPr>
-                      <w:rFonts w:ascii="굴림" w:eastAsia="굴림" w:cs="굴림"/>
-                      <w:color w:val="auto"/>
-                    </w:rPr>
-                    <w:t xml:space="preserve"> 서비스</w:t>
+                    <w:t>농식품 팜맵 서비스</w:t>
                   </w:r>
                 </w:p>
               </w:tc>
@@ -3460,17 +3095,8 @@
                       <w:rFonts w:ascii="굴림" w:eastAsia="굴림" w:cs="굴림"/>
                       <w:color w:val="auto"/>
                     </w:rPr>
-                    <w:t xml:space="preserve">농사로 </w:t>
+                    <w:t>농사로 OpenAPI</w:t>
                   </w:r>
-                  <w:proofErr w:type="spellStart"/>
-                  <w:r>
-                    <w:rPr>
-                      <w:rFonts w:ascii="굴림" w:eastAsia="굴림" w:cs="굴림"/>
-                      <w:color w:val="auto"/>
-                    </w:rPr>
-                    <w:t>OpenAPI</w:t>
-                  </w:r>
-                  <w:proofErr w:type="spellEnd"/>
                 </w:p>
               </w:tc>
               <w:tc>
@@ -3539,39 +3165,7 @@
                       <w:rFonts w:ascii="굴림" w:eastAsia="굴림" w:cs="굴림"/>
                       <w:color w:val="auto"/>
                     </w:rPr>
-                    <w:t xml:space="preserve">병해충 정보, </w:t>
-                  </w:r>
-                  <w:proofErr w:type="spellStart"/>
-                  <w:r>
-                    <w:rPr>
-                      <w:rFonts w:ascii="굴림" w:eastAsia="굴림" w:cs="굴림"/>
-                      <w:color w:val="auto"/>
-                    </w:rPr>
-                    <w:t>주간농사정보</w:t>
-                  </w:r>
-                  <w:proofErr w:type="spellEnd"/>
-                  <w:r>
-                    <w:rPr>
-                      <w:rFonts w:ascii="굴림" w:eastAsia="굴림" w:cs="굴림"/>
-                      <w:color w:val="auto"/>
-                    </w:rPr>
-                    <w:t xml:space="preserve">, </w:t>
-                  </w:r>
-                  <w:proofErr w:type="spellStart"/>
-                  <w:r>
-                    <w:rPr>
-                      <w:rFonts w:ascii="굴림" w:eastAsia="굴림" w:cs="굴림"/>
-                      <w:color w:val="auto"/>
-                    </w:rPr>
-                    <w:t>농작업</w:t>
-                  </w:r>
-                  <w:proofErr w:type="spellEnd"/>
-                  <w:r>
-                    <w:rPr>
-                      <w:rFonts w:ascii="굴림" w:eastAsia="굴림" w:cs="굴림"/>
-                      <w:color w:val="auto"/>
-                    </w:rPr>
-                    <w:t xml:space="preserve"> 정보, 농약안전사용지침 조회</w:t>
+                    <w:t>병해충 정보, 주간농사정보, 농작업 정보, 농약안전사용지침 조회</w:t>
                   </w:r>
                 </w:p>
               </w:tc>
@@ -3638,22 +3232,13 @@
                       <w:color w:val="auto"/>
                     </w:rPr>
                   </w:pPr>
-                  <w:proofErr w:type="spellStart"/>
                   <w:proofErr w:type="gramStart"/>
                   <w:r>
                     <w:rPr>
                       <w:rFonts w:ascii="굴림" w:eastAsia="굴림" w:cs="굴림"/>
                       <w:color w:val="auto"/>
                     </w:rPr>
-                    <w:t>공공데이터포털</w:t>
-                  </w:r>
-                  <w:proofErr w:type="spellEnd"/>
-                  <w:r>
-                    <w:rPr>
-                      <w:rFonts w:ascii="굴림" w:eastAsia="굴림" w:cs="굴림"/>
-                      <w:color w:val="auto"/>
-                    </w:rPr>
-                    <w:t xml:space="preserve"> /</w:t>
+                    <w:t>공공데이터포털 /</w:t>
                   </w:r>
                   <w:proofErr w:type="gramEnd"/>
                   <w:r>
@@ -3798,21 +3383,12 @@
                       <w:color w:val="auto"/>
                     </w:rPr>
                   </w:pPr>
-                  <w:proofErr w:type="spellStart"/>
                   <w:r>
                     <w:rPr>
                       <w:rFonts w:ascii="굴림" w:eastAsia="굴림" w:cs="굴림"/>
                       <w:color w:val="auto"/>
                     </w:rPr>
-                    <w:t>병징</w:t>
-                  </w:r>
-                  <w:proofErr w:type="spellEnd"/>
-                  <w:r>
-                    <w:rPr>
-                      <w:rFonts w:ascii="굴림" w:eastAsia="굴림" w:cs="굴림"/>
-                      <w:color w:val="auto"/>
-                    </w:rPr>
-                    <w:t xml:space="preserve"> 사진 분석, 체크리스트</w:t>
+                    <w:t>병징 사진 분석, 체크리스트</w:t>
                   </w:r>
                   <w:r>
                     <w:rPr>
@@ -3846,23 +3422,7 @@
                 <w:rFonts w:ascii="굴림" w:eastAsia="굴림" w:cs="굴림"/>
                 <w:color w:val="auto"/>
               </w:rPr>
-              <w:t xml:space="preserve">서비스에서 공공데이터의 비중은 높다. </w:t>
-            </w:r>
-            <w:proofErr w:type="spellStart"/>
-            <w:r>
-              <w:rPr>
-                <w:rFonts w:ascii="굴림" w:eastAsia="굴림" w:cs="굴림"/>
-                <w:color w:val="auto"/>
-              </w:rPr>
-              <w:t>팜맵은</w:t>
-            </w:r>
-            <w:proofErr w:type="spellEnd"/>
-            <w:r>
-              <w:rPr>
-                <w:rFonts w:ascii="굴림" w:eastAsia="굴림" w:cs="굴림"/>
-                <w:color w:val="auto"/>
-              </w:rPr>
-              <w:t xml:space="preserve"> 필지 단위 서비스의 기준 데이터이며, 농사로 데이터는 병해충</w:t>
+              <w:t>서비스에서 공공데이터의 비중은 높다. 팜맵은 필지 단위 서비스의 기준 데이터이며, 농사로 데이터는 병해충</w:t>
             </w:r>
             <w:r>
               <w:rPr>
@@ -3885,21 +3445,12 @@
               </w:rPr>
               <w:t>·</w:t>
             </w:r>
-            <w:proofErr w:type="spellStart"/>
-            <w:r>
-              <w:rPr>
-                <w:rFonts w:ascii="굴림" w:eastAsia="굴림" w:cs="굴림"/>
-                <w:color w:val="auto"/>
-              </w:rPr>
-              <w:t>농작업</w:t>
-            </w:r>
-            <w:proofErr w:type="spellEnd"/>
-            <w:r>
-              <w:rPr>
-                <w:rFonts w:ascii="굴림" w:eastAsia="굴림" w:cs="굴림"/>
-                <w:color w:val="auto"/>
-              </w:rPr>
-              <w:t xml:space="preserve"> 판단의 공식 근거로 사용된다. 기상청 예보는 오늘의 위험도와 작업 우선순위 산정에 사용된다.</w:t>
+            <w:r>
+              <w:rPr>
+                <w:rFonts w:ascii="굴림" w:eastAsia="굴림" w:cs="굴림"/>
+                <w:color w:val="auto"/>
+              </w:rPr>
+              <w:t>농작업 판단의 공식 근거로 사용된다. 기상청 예보는 오늘의 위험도와 작업 우선순위 산정에 사용된다.</w:t>
             </w:r>
           </w:p>
           <w:p>
@@ -3916,23 +3467,7 @@
                 <w:rFonts w:ascii="굴림" w:eastAsia="굴림" w:cs="굴림"/>
                 <w:color w:val="auto"/>
               </w:rPr>
-              <w:t xml:space="preserve">공공데이터 획득은 각 기관 </w:t>
-            </w:r>
-            <w:proofErr w:type="spellStart"/>
-            <w:r>
-              <w:rPr>
-                <w:rFonts w:ascii="굴림" w:eastAsia="굴림" w:cs="굴림"/>
-                <w:color w:val="auto"/>
-              </w:rPr>
-              <w:t>OpenAPI</w:t>
-            </w:r>
-            <w:proofErr w:type="spellEnd"/>
-            <w:r>
-              <w:rPr>
-                <w:rFonts w:ascii="굴림" w:eastAsia="굴림" w:cs="굴림"/>
-                <w:color w:val="auto"/>
-              </w:rPr>
-              <w:t xml:space="preserve"> 인증키 발급 후 서버 측 API 호출 방식으로 처리한다. API 응답 데이터는 서비스 화면 표시, 위험도 계산, AI 프롬프트 입력, 상담용 리포트 생성에 활용한다.</w:t>
+              <w:t>공공데이터 획득은 각 기관 OpenAPI 인증키 발급 후 서버 측 API 호출 방식으로 처리한다. API 응답 데이터는 서비스 화면 표시, 위험도 계산, AI 프롬프트 입력, 상담용 리포트 생성에 활용한다.</w:t>
             </w:r>
           </w:p>
           <w:p>
@@ -4164,37 +3699,12 @@
               </w:rPr>
               <w:t xml:space="preserve"> </w:t>
             </w:r>
-            <w:proofErr w:type="spellStart"/>
-            <w:r>
-              <w:rPr>
-                <w:rFonts w:ascii="굴림" w:eastAsia="굴림" w:cs="굴림"/>
-                <w:color w:val="auto"/>
-              </w:rPr>
-              <w:t>FieldGuard</w:t>
-            </w:r>
-            <w:proofErr w:type="spellEnd"/>
-            <w:r>
-              <w:rPr>
-                <w:rFonts w:ascii="굴림" w:eastAsia="굴림" w:cs="굴림"/>
-                <w:color w:val="auto"/>
-              </w:rPr>
-              <w:t xml:space="preserve"> AI를 통해 농민은 매일 확인해야 하는 기상, 병해충, </w:t>
-            </w:r>
-            <w:proofErr w:type="spellStart"/>
-            <w:r>
-              <w:rPr>
-                <w:rFonts w:ascii="굴림" w:eastAsia="굴림" w:cs="굴림"/>
-                <w:color w:val="auto"/>
-              </w:rPr>
-              <w:t>농작업</w:t>
-            </w:r>
-            <w:proofErr w:type="spellEnd"/>
-            <w:r>
-              <w:rPr>
-                <w:rFonts w:ascii="굴림" w:eastAsia="굴림" w:cs="굴림"/>
-                <w:color w:val="auto"/>
-              </w:rPr>
-              <w:t>, 농약안전사용 정보를 한 화면에서 확인할 수 있다. 정보 탐색 시간이 줄고, 위험 요인에 대한 선제 대응이 가능해진다.</w:t>
+            <w:r>
+              <w:rPr>
+                <w:rFonts w:ascii="굴림" w:eastAsia="굴림" w:cs="굴림"/>
+                <w:color w:val="auto"/>
+              </w:rPr>
+              <w:t>FieldGuard AI를 통해 농민은 매일 확인해야 하는 기상, 병해충, 농작업, 농약안전사용 정보를 한 화면에서 확인할 수 있다. 정보 탐색 시간이 줄고, 위험 요인에 대한 선제 대응이 가능해진다.</w:t>
             </w:r>
           </w:p>
           <w:p>
@@ -4283,21 +3793,12 @@
                 <w:color w:val="auto"/>
               </w:rPr>
             </w:pPr>
-            <w:proofErr w:type="spellStart"/>
-            <w:r>
-              <w:rPr>
-                <w:rFonts w:ascii="굴림" w:eastAsia="굴림" w:cs="굴림"/>
-                <w:color w:val="auto"/>
-              </w:rPr>
-              <w:t>농작업</w:t>
-            </w:r>
-            <w:proofErr w:type="spellEnd"/>
-            <w:r>
-              <w:rPr>
-                <w:rFonts w:ascii="굴림" w:eastAsia="굴림" w:cs="굴림"/>
-                <w:color w:val="auto"/>
-              </w:rPr>
-              <w:t xml:space="preserve"> 우선순위 판단 보조</w:t>
+            <w:r>
+              <w:rPr>
+                <w:rFonts w:ascii="굴림" w:eastAsia="굴림" w:cs="굴림"/>
+                <w:color w:val="auto"/>
+              </w:rPr>
+              <w:t>농작업 우선순위 판단 보조</w:t>
             </w:r>
           </w:p>
           <w:p>
@@ -4355,7 +3856,6 @@
                 <w:color w:val="auto"/>
               </w:rPr>
             </w:pPr>
-            <w:proofErr w:type="spellStart"/>
             <w:r>
               <w:rPr>
                 <w:rFonts w:ascii="굴림" w:eastAsia="굴림" w:cs="굴림"/>
@@ -4363,7 +3863,6 @@
               </w:rPr>
               <w:t>팜맵</w:t>
             </w:r>
-            <w:proofErr w:type="spellEnd"/>
             <w:r>
               <w:rPr>
                 <w:rFonts w:ascii="굴림" w:eastAsia="굴림" w:cs="굴림"/>
@@ -4501,45 +4000,12 @@
                 <w:color w:val="auto"/>
               </w:rPr>
             </w:pPr>
-            <w:proofErr w:type="spellStart"/>
-            <w:r>
-              <w:rPr>
-                <w:rFonts w:ascii="굴림" w:eastAsia="굴림" w:cs="굴림"/>
-                <w:color w:val="auto"/>
-              </w:rPr>
-              <w:t>FieldGuard</w:t>
-            </w:r>
-            <w:proofErr w:type="spellEnd"/>
-            <w:r>
-              <w:rPr>
-                <w:rFonts w:ascii="굴림" w:eastAsia="굴림" w:cs="굴림"/>
-                <w:color w:val="auto"/>
-              </w:rPr>
-              <w:t xml:space="preserve"> AI는 </w:t>
-            </w:r>
-            <w:proofErr w:type="spellStart"/>
-            <w:r>
-              <w:rPr>
-                <w:rFonts w:ascii="굴림" w:eastAsia="굴림" w:cs="굴림"/>
-                <w:color w:val="auto"/>
-              </w:rPr>
-              <w:t>농민용</w:t>
-            </w:r>
-            <w:proofErr w:type="spellEnd"/>
-            <w:r>
-              <w:rPr>
-                <w:rFonts w:ascii="굴림" w:eastAsia="굴림" w:cs="굴림"/>
-                <w:color w:val="auto"/>
-              </w:rPr>
-              <w:t xml:space="preserve"> Web App 시제품 개발을 완료하였다. </w:t>
-            </w:r>
-            <w:proofErr w:type="spellStart"/>
-            <w:r>
-              <w:rPr>
-                <w:rFonts w:ascii="굴림" w:eastAsia="굴림" w:cs="굴림"/>
-                <w:color w:val="auto"/>
-              </w:rPr>
-              <w:t>React</w:t>
+            <w:r>
+              <w:rPr>
+                <w:rFonts w:ascii="굴림" w:eastAsia="굴림" w:cs="굴림"/>
+                <w:color w:val="auto"/>
+              </w:rPr>
+              <w:t>FieldGuard AI는 농민용 Web App 시제품 개발을 완료하였다. React</w:t>
             </w:r>
             <w:r>
               <w:rPr>
@@ -4553,31 +4019,7 @@
                 <w:rFonts w:ascii="굴림" w:eastAsia="굴림" w:cs="굴림"/>
                 <w:color w:val="auto"/>
               </w:rPr>
-              <w:t>TypeScript</w:t>
-            </w:r>
-            <w:proofErr w:type="spellEnd"/>
-            <w:r>
-              <w:rPr>
-                <w:rFonts w:ascii="굴림" w:eastAsia="굴림" w:cs="굴림"/>
-                <w:color w:val="auto"/>
-              </w:rPr>
-              <w:t xml:space="preserve"> 기반으로 로그인, 필지 등록, </w:t>
-            </w:r>
-            <w:proofErr w:type="spellStart"/>
-            <w:r>
-              <w:rPr>
-                <w:rFonts w:ascii="굴림" w:eastAsia="굴림" w:cs="굴림"/>
-                <w:color w:val="auto"/>
-              </w:rPr>
-              <w:t>팜맵</w:t>
-            </w:r>
-            <w:proofErr w:type="spellEnd"/>
-            <w:r>
-              <w:rPr>
-                <w:rFonts w:ascii="굴림" w:eastAsia="굴림" w:cs="굴림"/>
-                <w:color w:val="auto"/>
-              </w:rPr>
-              <w:t xml:space="preserve"> 기반 필지 조회, 기상</w:t>
+              <w:t>TypeScript 기반으로 로그인, 필지 등록, 팜맵 기반 필지 조회, 기상</w:t>
             </w:r>
             <w:r>
               <w:rPr>
@@ -4607,15 +4049,15 @@
             <w:pPr>
               <w:pStyle w:val="a8"/>
               <w:rPr>
+                <w:rFonts w:ascii="굴림" w:eastAsia="굴림" w:cs="굴림"/>
+                <w:color w:val="auto"/>
+              </w:rPr>
+            </w:pPr>
+            <w:r>
+              <w:rPr>
                 <w:rFonts w:ascii="굴림" w:eastAsia="굴림" w:cs="굴림" w:hint="eastAsia"/>
                 <w:color w:val="auto"/>
               </w:rPr>
-            </w:pPr>
-            <w:r>
-              <w:rPr>
-                <w:rFonts w:ascii="굴림" w:eastAsia="굴림" w:cs="굴림" w:hint="eastAsia"/>
-                <w:color w:val="auto"/>
-              </w:rPr>
               <w:t>공공데이터는</w:t>
             </w:r>
             <w:r>
@@ -4623,23 +4065,7 @@
                 <w:rFonts w:ascii="굴림" w:eastAsia="굴림" w:cs="굴림"/>
                 <w:color w:val="auto"/>
               </w:rPr>
-              <w:t xml:space="preserve"> </w:t>
-            </w:r>
-            <w:proofErr w:type="spellStart"/>
-            <w:r>
-              <w:rPr>
-                <w:rFonts w:ascii="굴림" w:eastAsia="굴림" w:cs="굴림"/>
-                <w:color w:val="auto"/>
-              </w:rPr>
-              <w:t>팜맵</w:t>
-            </w:r>
-            <w:proofErr w:type="spellEnd"/>
-            <w:r>
-              <w:rPr>
-                <w:rFonts w:ascii="굴림" w:eastAsia="굴림" w:cs="굴림"/>
-                <w:color w:val="auto"/>
-              </w:rPr>
-              <w:t xml:space="preserve">, 기상청 단기예보, 농사로 데이터를 연계하였다. </w:t>
+              <w:t xml:space="preserve"> 팜맵, 기상청 단기예보, 농사로 데이터를 연계하였다. </w:t>
             </w:r>
             <w:r>
               <w:rPr>
@@ -4653,23 +4079,7 @@
                 <w:rFonts w:ascii="굴림" w:eastAsia="굴림" w:cs="굴림"/>
                 <w:color w:val="auto"/>
               </w:rPr>
-              <w:t xml:space="preserve">AI 기능은 Gemini를 활용해 </w:t>
-            </w:r>
-            <w:proofErr w:type="spellStart"/>
-            <w:r>
-              <w:rPr>
-                <w:rFonts w:ascii="굴림" w:eastAsia="굴림" w:cs="굴림"/>
-                <w:color w:val="auto"/>
-              </w:rPr>
-              <w:t>병징</w:t>
-            </w:r>
-            <w:proofErr w:type="spellEnd"/>
-            <w:r>
-              <w:rPr>
-                <w:rFonts w:ascii="굴림" w:eastAsia="굴림" w:cs="굴림"/>
-                <w:color w:val="auto"/>
-              </w:rPr>
-              <w:t xml:space="preserve"> 사진의 의심 후보, 판단 근거, 추가 촬영 안내, 현장 확인 체크리스트를 제공하도록 구현하였다. 단, 확정 진단이나 농약 처방이 아닌 의사결정 보조 기능으로 설계하였다</w:t>
+              <w:t>AI 기능은 Gemini를 활용해 병징 사진의 의심 후보, 판단 근거, 추가 촬영 안내, 현장 확인 체크리스트를 제공하도록 구현하였다. 단, 확정 진단이나 농약 처방이 아닌 의사결정 보조 기능으로 설계하였다</w:t>
             </w:r>
           </w:p>
         </w:tc>
@@ -4796,13 +4206,111 @@
       <w:pPr>
         <w:pStyle w:val="a8"/>
         <w:rPr>
+          <w:rFonts w:hint="eastAsia"/>
+          <w:b/>
+          <w:bCs/>
+          <w:color w:val="auto"/>
+          <w:sz w:val="44"/>
+          <w:szCs w:val="44"/>
+        </w:rPr>
+      </w:pPr>
+      <w:r>
+        <w:rPr>
           <w:b/>
           <w:bCs/>
           <w:color w:val="auto"/>
           <w:sz w:val="28"/>
           <w:szCs w:val="28"/>
         </w:rPr>
-      </w:pPr>
+        <w:br/>
+      </w:r>
+      <w:r>
+        <w:rPr>
+          <w:b/>
+          <w:bCs/>
+          <w:color w:val="auto"/>
+          <w:sz w:val="44"/>
+          <w:szCs w:val="44"/>
+        </w:rPr>
+        <w:br/>
+      </w:r>
+      <w:r>
+        <w:rPr>
+          <w:rFonts w:hint="eastAsia"/>
+          <w:b/>
+          <w:bCs/>
+          <w:color w:val="auto"/>
+          <w:sz w:val="44"/>
+          <w:szCs w:val="44"/>
+        </w:rPr>
+        <w:t>#프로그램 작동 영상 링크(작동</w:t>
+      </w:r>
+      <w:r>
+        <w:rPr>
+          <w:rFonts w:hint="eastAsia"/>
+          <w:b/>
+          <w:bCs/>
+          <w:color w:val="auto"/>
+          <w:sz w:val="44"/>
+          <w:szCs w:val="44"/>
+        </w:rPr>
+        <w:t xml:space="preserve"> </w:t>
+      </w:r>
+      <w:r>
+        <w:rPr>
+          <w:rFonts w:hint="eastAsia"/>
+          <w:b/>
+          <w:bCs/>
+          <w:color w:val="auto"/>
+          <w:sz w:val="44"/>
+          <w:szCs w:val="44"/>
+        </w:rPr>
+        <w:t xml:space="preserve">영상링크를 올려서 따로 기획서에 스크린샷은 </w:t>
+      </w:r>
+      <w:proofErr w:type="gramStart"/>
+      <w:r>
+        <w:rPr>
+          <w:rFonts w:hint="eastAsia"/>
+          <w:b/>
+          <w:bCs/>
+          <w:color w:val="auto"/>
+          <w:sz w:val="44"/>
+          <w:szCs w:val="44"/>
+        </w:rPr>
+        <w:t>하지않음</w:t>
+      </w:r>
+      <w:proofErr w:type="gramEnd"/>
+      <w:r>
+        <w:rPr>
+          <w:rFonts w:hint="eastAsia"/>
+          <w:b/>
+          <w:bCs/>
+          <w:color w:val="auto"/>
+          <w:sz w:val="44"/>
+          <w:szCs w:val="44"/>
+        </w:rPr>
+        <w:t>)</w:t>
+      </w:r>
+      <w:r>
+        <w:rPr>
+          <w:b/>
+          <w:bCs/>
+          <w:color w:val="auto"/>
+          <w:sz w:val="44"/>
+          <w:szCs w:val="44"/>
+        </w:rPr>
+        <w:br/>
+      </w:r>
+      <w:r>
+        <w:rPr>
+          <w:b/>
+          <w:bCs/>
+          <w:color w:val="auto"/>
+          <w:sz w:val="44"/>
+          <w:szCs w:val="44"/>
+        </w:rPr>
+        <w:br/>
+      </w:r>
     </w:p>
     <w:sectPr>
       <w:headerReference w:type="default" r:id="rId7"/>
@@ -6170,6 +5678,7 @@
   <w:style w:type="character" w:default="1" w:styleId="a0">
     <w:name w:val="Default Paragraph Font"/>
     <w:uiPriority w:val="1"/>
+    <w:semiHidden/>
     <w:unhideWhenUsed/>
   </w:style>
   <w:style w:type="table" w:default="1" w:styleId="a1">

</xml_diff>